<commit_message>
docs: add authors Alejandro Rodriguez Cortes and Nicolas Mejia Ochoa across report, notebook, and arduino code
</commit_message>
<xml_diff>
--- a/informe/informe_ieee_seoul_bike.docx
+++ b/informe/informe_ieee_seoul_bike.docx
@@ -25,9 +25,11 @@
           <w:i/>
           <w:sz w:val="20"/>
         </w:rPr>
-        <w:t>Estudiantes de Redes Neuronales Artificiales y Deep Learning</w:t>
+        <w:t>Alejandro Rodríguez Cortés (Cód. 2225645)  |  Nicolás Mejía Ochoa (Cód. 2205076)</w:t>
         <w:br/>
-        <w:t>Profesor: Jesús Alfonso López S.</w:t>
+        <w:t>Asignatura: Redes Neuronales Artificiales y Deep Learning</w:t>
+        <w:br/>
+        <w:t>Docente Evaluador: Prof. Jesús Alfonso López S.</w:t>
         <w:br/>
         <w:t>Facultad de Ingeniería - Universidad Autónoma de Occidente, Cali, Colombia</w:t>
       </w:r>

</xml_diff>